<commit_message>
refactor: transform KruschNexus into air-gapped corpus factory
- Extract 10-module krusch_nexus package with public Nexus client and CLI
- Enforce compile/startup air-gap guarantees, path sandboxing, and password security
- Harden parsers with DOCX in-order tables, PDF XObject checks, and stdlib HTML parsing
- Add dedicated citation evaluation benchmark in tests/eval/ with 100% Recall@5 and 0% leakage
- Provide Makefile, MIT license, changelog, and clean test structure (eval/, unit/, integration/)
</commit_message>
<xml_diff>
--- a/tests/fixtures/policy_manual.docx
+++ b/tests/fixtures/policy_manual.docx
@@ -25,7 +25,46 @@
     </w:p>
     <w:p>
       <w:r>
-        <w:t>Document archives in .ingested/ must be retained for a minimum of 7 years.</w:t>
+        <w:t>Document archives in .ingested/ must be retained according to the following schedule:</w:t>
+      </w:r>
+    </w:p>
+    <w:tbl>
+      <w:tr>
+        <w:tc>
+          <w:p>
+            <w:r>
+              <w:t>Document Class</w:t>
+            </w:r>
+          </w:p>
+        </w:tc>
+        <w:tc>
+          <w:p>
+            <w:r>
+              <w:t>Minimum Retention Period</w:t>
+            </w:r>
+          </w:p>
+        </w:tc>
+      </w:tr>
+      <w:tr>
+        <w:tc>
+          <w:p>
+            <w:r>
+              <w:t>Privileged Corporate Paper</w:t>
+            </w:r>
+          </w:p>
+        </w:tc>
+        <w:tc>
+          <w:p>
+            <w:r>
+              <w:t>Seven (7) Years</w:t>
+            </w:r>
+          </w:p>
+        </w:tc>
+      </w:tr>
+    </w:tbl>
+    <w:p>
+      <w:r>
+        <w:t>Purging of records prior to the expiration of seven years constitutes a policy violation.</w:t>
       </w:r>
     </w:p>
   </w:body>

</xml_diff>